<commit_message>
audit tibb v5 — suppression 19 items da'îf, passage 60 → 41 remèdes solides
Items retirés : 4 (olive), 8 (sanâ), 9 (gomme), 12 (jeûne), 13 (qaylûla),
15 (henné), 23 (grenade), 24 (eau matin), 25 (marche), 27 (Yâsîn),
32 (moutarde), 38 (câprier), 47 (Maghrib), 49 (rire), 52 (earthing),
53 (fenouil), 55 (bain salé), 56 (Fajr), 59 (khalwa).
Renumérotation tibb_001→tibb_041. Docx régénéré.

Co-Authored-By: Claude Opus 4.6 (1M context) <noreply@anthropic.com>
</commit_message>
<xml_diff>
--- a/ECRITS_NIYYAH/tibb.docx
+++ b/ECRITS_NIYYAH/tibb.docx
@@ -15,7 +15,7 @@
           <w:sz w:val="36"/>
           <w:szCs w:val="36"/>
         </w:rPr>
-        <w:t xml:space="preserve">Tibb - 60 remèdes</w:t>
+        <w:t xml:space="preserve">Tibb - 41 remèdes</w:t>
       </w:r>
     </w:p>
     <w:p>
@@ -293,89 +293,7 @@
           <w:sz w:val="28"/>
           <w:szCs w:val="28"/>
         </w:rPr>
-        <w:t xml:space="preserve">4. L'huile d'olive (زيت الزيتون)</w:t>
-      </w:r>
-    </w:p>
-    <w:p>
-      <w:pPr>
-        <w:spacing w:after="80"/>
-      </w:pPr>
-      <w:r>
-        <w:rPr>
-          <w:rFonts w:ascii="Cormorant Garamond" w:cs="Cormorant Garamond" w:eastAsia="Cormorant Garamond" w:hAnsi="Cormorant Garamond"/>
-          <w:i/>
-          <w:iCs/>
-          <w:sz w:val="22"/>
-          <w:szCs w:val="22"/>
-        </w:rPr>
-        <w:t xml:space="preserve">Pour : Santé cardiovasculaire, peau, cheveux, digestion</w:t>
-      </w:r>
-    </w:p>
-    <w:p>
-      <w:pPr>
-        <w:spacing w:after="60"/>
-      </w:pPr>
-      <w:r>
-        <w:rPr>
-          <w:rFonts w:ascii="Cormorant Garamond" w:cs="Cormorant Garamond" w:eastAsia="Cormorant Garamond" w:hAnsi="Cormorant Garamond"/>
-          <w:sz w:val="22"/>
-          <w:szCs w:val="22"/>
-        </w:rPr>
-        <w:t xml:space="preserve">Interne : 1-2 cuillères à soupe par jour sur la nourriture. Externe : massages, application sur la peau et les cheveux.</w:t>
-      </w:r>
-    </w:p>
-    <w:p>
-      <w:pPr>
-        <w:spacing w:after="60" w:before="80"/>
-      </w:pPr>
-      <w:r>
-        <w:rPr>
-          <w:rFonts w:ascii="Cormorant Garamond" w:cs="Cormorant Garamond" w:eastAsia="Cormorant Garamond" w:hAnsi="Cormorant Garamond"/>
-          <w:i/>
-          <w:iCs/>
-          <w:color w:val="555555"/>
-          <w:sz w:val="20"/>
-          <w:szCs w:val="20"/>
-        </w:rPr>
-        <w:t xml:space="preserve">Source : Coran 24:35 (An-Nûr) — 'arbre béni'. Hadith Tirmidhî : 'Mangez de l'olive et oignez-vous-en, car elle provient d'un arbre béni.'</w:t>
-      </w:r>
-    </w:p>
-    <w:p>
-      <w:pPr>
-        <w:spacing w:after="80"/>
-      </w:pPr>
-      <w:r>
-        <w:rPr>
-          <w:rFonts w:ascii="Cormorant Garamond" w:cs="Cormorant Garamond" w:eastAsia="Cormorant Garamond" w:hAnsi="Cormorant Garamond"/>
-          <w:color w:val="666666"/>
-          <w:sz w:val="20"/>
-          <w:szCs w:val="20"/>
-        </w:rPr>
-        <w:t xml:space="preserve">Note : Des études suggèrent que le régime méditerranéen réduit le risque cardiovasculaire de 30%. Acide oléique, vitamine E, antioxydants.</w:t>
-      </w:r>
-    </w:p>
-    <w:p>
-      <w:pPr>
-        <w:pBdr>
-          <w:bottom w:val="single" w:color="CCCCCC" w:sz="1"/>
-        </w:pBdr>
-        <w:spacing w:after="200" w:before="100"/>
-      </w:pPr>
-    </w:p>
-    <w:p>
-      <w:pPr>
-        <w:pStyle w:val="Heading2"/>
-        <w:spacing w:after="80" w:before="240"/>
-      </w:pPr>
-      <w:r>
-        <w:rPr>
-          <w:rFonts w:ascii="Cormorant Garamond" w:cs="Cormorant Garamond" w:eastAsia="Cormorant Garamond" w:hAnsi="Cormorant Garamond"/>
-          <w:b/>
-          <w:bCs/>
-          <w:sz w:val="28"/>
-          <w:szCs w:val="28"/>
-        </w:rPr>
-        <w:t xml:space="preserve">5. La talbîna (bouillie d'orge) (التلبينة)</w:t>
+        <w:t xml:space="preserve">4. La talbîna (bouillie d'orge) (التلبينة)</w:t>
       </w:r>
     </w:p>
     <w:p>
@@ -457,7 +375,7 @@
           <w:sz w:val="28"/>
           <w:szCs w:val="28"/>
         </w:rPr>
-        <w:t xml:space="preserve">6. L'eau de Zamzam (ماء زمزم)</w:t>
+        <w:t xml:space="preserve">5. L'eau de Zamzam (ماء زمزم)</w:t>
       </w:r>
     </w:p>
     <w:p>
@@ -539,7 +457,7 @@
           <w:sz w:val="28"/>
           <w:szCs w:val="28"/>
         </w:rPr>
-        <w:t xml:space="preserve">7. Le siwâk / miswâk (arak) (السواك)</w:t>
+        <w:t xml:space="preserve">6. Le siwâk / miswâk (arak) (السواك)</w:t>
       </w:r>
     </w:p>
     <w:p>
@@ -621,171 +539,7 @@
           <w:sz w:val="28"/>
           <w:szCs w:val="28"/>
         </w:rPr>
-        <w:t xml:space="preserve">8. Le sanâ (séné) — laxatif (السنا)</w:t>
-      </w:r>
-    </w:p>
-    <w:p>
-      <w:pPr>
-        <w:spacing w:after="80"/>
-      </w:pPr>
-      <w:r>
-        <w:rPr>
-          <w:rFonts w:ascii="Cormorant Garamond" w:cs="Cormorant Garamond" w:eastAsia="Cormorant Garamond" w:hAnsi="Cormorant Garamond"/>
-          <w:i/>
-          <w:iCs/>
-          <w:sz w:val="22"/>
-          <w:szCs w:val="22"/>
-        </w:rPr>
-        <w:t xml:space="preserve">Pour : Constipation, détoxification intestinale</w:t>
-      </w:r>
-    </w:p>
-    <w:p>
-      <w:pPr>
-        <w:spacing w:after="60"/>
-      </w:pPr>
-      <w:r>
-        <w:rPr>
-          <w:rFonts w:ascii="Cormorant Garamond" w:cs="Cormorant Garamond" w:eastAsia="Cormorant Garamond" w:hAnsi="Cormorant Garamond"/>
-          <w:sz w:val="22"/>
-          <w:szCs w:val="22"/>
-        </w:rPr>
-        <w:t xml:space="preserve">Infusion de feuilles séchées (1 cuillère à café dans une tasse d'eau bouillante). Boire le soir, effet 8-12h plus tard.</w:t>
-      </w:r>
-    </w:p>
-    <w:p>
-      <w:pPr>
-        <w:spacing w:after="60" w:before="80"/>
-      </w:pPr>
-      <w:r>
-        <w:rPr>
-          <w:rFonts w:ascii="Cormorant Garamond" w:cs="Cormorant Garamond" w:eastAsia="Cormorant Garamond" w:hAnsi="Cormorant Garamond"/>
-          <w:i/>
-          <w:iCs/>
-          <w:color w:val="555555"/>
-          <w:sz w:val="20"/>
-          <w:szCs w:val="20"/>
-        </w:rPr>
-        <w:t xml:space="preserve">Source : Ibn Mâja 3457 : 'Faites usage du sanâ et du sanût, car ils contiennent un remède contre toute maladie sauf as-sâm (la mort).' Les savants expliquent qu'il est une cause de guérison pour de nombreuses maladies, par la permission d'Allâh.</w:t>
-      </w:r>
-    </w:p>
-    <w:p>
-      <w:pPr>
-        <w:spacing w:after="80"/>
-      </w:pPr>
-      <w:r>
-        <w:rPr>
-          <w:rFonts w:ascii="Cormorant Garamond" w:cs="Cormorant Garamond" w:eastAsia="Cormorant Garamond" w:hAnsi="Cormorant Garamond"/>
-          <w:color w:val="666666"/>
-          <w:sz w:val="20"/>
-          <w:szCs w:val="20"/>
-        </w:rPr>
-        <w:t xml:space="preserve">Note : Laxatif stimulant reconnu en pharmacopée. À utiliser ponctuellement, pas en continu (risque de dépendance intestinale). Contre-indiqué chez les femmes enceintes ou allaitantes, et chez les personnes souffrant d'inflammations chroniques du côlon (Crohn, RCH).</w:t>
-      </w:r>
-    </w:p>
-    <w:p>
-      <w:pPr>
-        <w:pBdr>
-          <w:bottom w:val="single" w:color="CCCCCC" w:sz="1"/>
-        </w:pBdr>
-        <w:spacing w:after="200" w:before="100"/>
-      </w:pPr>
-    </w:p>
-    <w:p>
-      <w:pPr>
-        <w:pStyle w:val="Heading2"/>
-        <w:spacing w:after="80" w:before="240"/>
-      </w:pPr>
-      <w:r>
-        <w:rPr>
-          <w:rFonts w:ascii="Cormorant Garamond" w:cs="Cormorant Garamond" w:eastAsia="Cormorant Garamond" w:hAnsi="Cormorant Garamond"/>
-          <w:b/>
-          <w:bCs/>
-          <w:sz w:val="28"/>
-          <w:szCs w:val="28"/>
-        </w:rPr>
-        <w:t xml:space="preserve">9. La gomme arabique (samgh) (الصمغ العربي)</w:t>
-      </w:r>
-    </w:p>
-    <w:p>
-      <w:pPr>
-        <w:spacing w:after="80"/>
-      </w:pPr>
-      <w:r>
-        <w:rPr>
-          <w:rFonts w:ascii="Cormorant Garamond" w:cs="Cormorant Garamond" w:eastAsia="Cormorant Garamond" w:hAnsi="Cormorant Garamond"/>
-          <w:i/>
-          <w:iCs/>
-          <w:sz w:val="22"/>
-          <w:szCs w:val="22"/>
-        </w:rPr>
-        <w:t xml:space="preserve">Pour : Maux d'estomac, ulcères, équilibre de la flore intestinale</w:t>
-      </w:r>
-    </w:p>
-    <w:p>
-      <w:pPr>
-        <w:spacing w:after="60"/>
-      </w:pPr>
-      <w:r>
-        <w:rPr>
-          <w:rFonts w:ascii="Cormorant Garamond" w:cs="Cormorant Garamond" w:eastAsia="Cormorant Garamond" w:hAnsi="Cormorant Garamond"/>
-          <w:sz w:val="22"/>
-          <w:szCs w:val="22"/>
-        </w:rPr>
-        <w:t xml:space="preserve">Diluer 1 cuillère dans un verre d'eau tiède. Boire le matin à jeun.</w:t>
-      </w:r>
-    </w:p>
-    <w:p>
-      <w:pPr>
-        <w:spacing w:after="60" w:before="80"/>
-      </w:pPr>
-      <w:r>
-        <w:rPr>
-          <w:rFonts w:ascii="Cormorant Garamond" w:cs="Cormorant Garamond" w:eastAsia="Cormorant Garamond" w:hAnsi="Cormorant Garamond"/>
-          <w:i/>
-          <w:iCs/>
-          <w:color w:val="555555"/>
-          <w:sz w:val="20"/>
-          <w:szCs w:val="20"/>
-        </w:rPr>
-        <w:t xml:space="preserve">Source : Hadith d'Ibn Mâja (faible mais cité par Ibn al-Qayyim) : recommandation traditionnelle pour les troubles digestifs.</w:t>
-      </w:r>
-    </w:p>
-    <w:p>
-      <w:pPr>
-        <w:spacing w:after="80"/>
-      </w:pPr>
-      <w:r>
-        <w:rPr>
-          <w:rFonts w:ascii="Cormorant Garamond" w:cs="Cormorant Garamond" w:eastAsia="Cormorant Garamond" w:hAnsi="Cormorant Garamond"/>
-          <w:color w:val="666666"/>
-          <w:sz w:val="20"/>
-          <w:szCs w:val="20"/>
-        </w:rPr>
-        <w:t xml:space="preserve">Note : Prébiotique reconnu. Améliore la flore intestinale. Études récentes : effets bénéfiques sur le côlon.</w:t>
-      </w:r>
-    </w:p>
-    <w:p>
-      <w:pPr>
-        <w:pBdr>
-          <w:bottom w:val="single" w:color="CCCCCC" w:sz="1"/>
-        </w:pBdr>
-        <w:spacing w:after="200" w:before="100"/>
-      </w:pPr>
-    </w:p>
-    <w:p>
-      <w:pPr>
-        <w:pStyle w:val="Heading2"/>
-        <w:spacing w:after="80" w:before="240"/>
-      </w:pPr>
-      <w:r>
-        <w:rPr>
-          <w:rFonts w:ascii="Cormorant Garamond" w:cs="Cormorant Garamond" w:eastAsia="Cormorant Garamond" w:hAnsi="Cormorant Garamond"/>
-          <w:b/>
-          <w:bCs/>
-          <w:sz w:val="28"/>
-          <w:szCs w:val="28"/>
-        </w:rPr>
-        <w:t xml:space="preserve">10. La sourate Al-Fâtiha (roqya) (سورة الفاتحة)</w:t>
+        <w:t xml:space="preserve">7. La sourate Al-Fâtiha (roqya) (سورة الفاتحة)</w:t>
       </w:r>
     </w:p>
     <w:p>
@@ -867,7 +621,7 @@
           <w:sz w:val="28"/>
           <w:szCs w:val="28"/>
         </w:rPr>
-        <w:t xml:space="preserve">11. Les Mu'awwidhât (sourates 113, 114) (المعوذتان)</w:t>
+        <w:t xml:space="preserve">8. Les Mu'awwidhât (sourates 113, 114) (المعوذتان)</w:t>
       </w:r>
     </w:p>
     <w:p>
@@ -949,171 +703,7 @@
           <w:sz w:val="28"/>
           <w:szCs w:val="28"/>
         </w:rPr>
-        <w:t xml:space="preserve">12. Le jeûne thérapeutique (الصيام العلاجي)</w:t>
-      </w:r>
-    </w:p>
-    <w:p>
-      <w:pPr>
-        <w:spacing w:after="80"/>
-      </w:pPr>
-      <w:r>
-        <w:rPr>
-          <w:rFonts w:ascii="Cormorant Garamond" w:cs="Cormorant Garamond" w:eastAsia="Cormorant Garamond" w:hAnsi="Cormorant Garamond"/>
-          <w:i/>
-          <w:iCs/>
-          <w:sz w:val="22"/>
-          <w:szCs w:val="22"/>
-        </w:rPr>
-        <w:t xml:space="preserve">Pour : Détoxification, perte de poids, régulation glycémie, longévité</w:t>
-      </w:r>
-    </w:p>
-    <w:p>
-      <w:pPr>
-        <w:spacing w:after="60"/>
-      </w:pPr>
-      <w:r>
-        <w:rPr>
-          <w:rFonts w:ascii="Cormorant Garamond" w:cs="Cormorant Garamond" w:eastAsia="Cormorant Garamond" w:hAnsi="Cormorant Garamond"/>
-          <w:sz w:val="22"/>
-          <w:szCs w:val="22"/>
-        </w:rPr>
-        <w:t xml:space="preserve">Jeûne complet du lever au coucher du soleil. Boire après iftar. Comme Ramadan ou jeûnes sunna (lundi-jeudi, jours blancs).</w:t>
-      </w:r>
-    </w:p>
-    <w:p>
-      <w:pPr>
-        <w:spacing w:after="60" w:before="80"/>
-      </w:pPr>
-      <w:r>
-        <w:rPr>
-          <w:rFonts w:ascii="Cormorant Garamond" w:cs="Cormorant Garamond" w:eastAsia="Cormorant Garamond" w:hAnsi="Cormorant Garamond"/>
-          <w:i/>
-          <w:iCs/>
-          <w:color w:val="555555"/>
-          <w:sz w:val="20"/>
-          <w:szCs w:val="20"/>
-        </w:rPr>
-        <w:t xml:space="preserve">Source : Hadith : 'Jeûnez, vous serez en bonne santé' (da'îf selon Al-Albâni et Al-'Irâqî. Hadith faible dans sa chaîne, mais dont le sens est corroboré par les règles générales de modération alimentaire en Islam).</w:t>
-      </w:r>
-    </w:p>
-    <w:p>
-      <w:pPr>
-        <w:spacing w:after="80"/>
-      </w:pPr>
-      <w:r>
-        <w:rPr>
-          <w:rFonts w:ascii="Cormorant Garamond" w:cs="Cormorant Garamond" w:eastAsia="Cormorant Garamond" w:hAnsi="Cormorant Garamond"/>
-          <w:color w:val="666666"/>
-          <w:sz w:val="20"/>
-          <w:szCs w:val="20"/>
-        </w:rPr>
-        <w:t xml:space="preserve">Note : Autophagie cellulaire (Prix Nobel 2016). Effets prouvés sur diabète, inflammation, fonctions cognitives, longévité.</w:t>
-      </w:r>
-    </w:p>
-    <w:p>
-      <w:pPr>
-        <w:pBdr>
-          <w:bottom w:val="single" w:color="CCCCCC" w:sz="1"/>
-        </w:pBdr>
-        <w:spacing w:after="200" w:before="100"/>
-      </w:pPr>
-    </w:p>
-    <w:p>
-      <w:pPr>
-        <w:pStyle w:val="Heading2"/>
-        <w:spacing w:after="80" w:before="240"/>
-      </w:pPr>
-      <w:r>
-        <w:rPr>
-          <w:rFonts w:ascii="Cormorant Garamond" w:cs="Cormorant Garamond" w:eastAsia="Cormorant Garamond" w:hAnsi="Cormorant Garamond"/>
-          <w:b/>
-          <w:bCs/>
-          <w:sz w:val="28"/>
-          <w:szCs w:val="28"/>
-        </w:rPr>
-        <w:t xml:space="preserve">13. Le repos après la salât du midi (qaylûla) (القيلولة)</w:t>
-      </w:r>
-    </w:p>
-    <w:p>
-      <w:pPr>
-        <w:spacing w:after="80"/>
-      </w:pPr>
-      <w:r>
-        <w:rPr>
-          <w:rFonts w:ascii="Cormorant Garamond" w:cs="Cormorant Garamond" w:eastAsia="Cormorant Garamond" w:hAnsi="Cormorant Garamond"/>
-          <w:i/>
-          <w:iCs/>
-          <w:sz w:val="22"/>
-          <w:szCs w:val="22"/>
-        </w:rPr>
-        <w:t xml:space="preserve">Pour : Récupération, mémoire, productivité après-midi</w:t>
-      </w:r>
-    </w:p>
-    <w:p>
-      <w:pPr>
-        <w:spacing w:after="60"/>
-      </w:pPr>
-      <w:r>
-        <w:rPr>
-          <w:rFonts w:ascii="Cormorant Garamond" w:cs="Cormorant Garamond" w:eastAsia="Cormorant Garamond" w:hAnsi="Cormorant Garamond"/>
-          <w:sz w:val="22"/>
-          <w:szCs w:val="22"/>
-        </w:rPr>
-        <w:t xml:space="preserve">Sieste courte (15-30 min) après la salât de Dhuhr. Idéalement avant 14h. Pas plus longtemps (risque d'engourdissement).</w:t>
-      </w:r>
-    </w:p>
-    <w:p>
-      <w:pPr>
-        <w:spacing w:after="60" w:before="80"/>
-      </w:pPr>
-      <w:r>
-        <w:rPr>
-          <w:rFonts w:ascii="Cormorant Garamond" w:cs="Cormorant Garamond" w:eastAsia="Cormorant Garamond" w:hAnsi="Cormorant Garamond"/>
-          <w:i/>
-          <w:iCs/>
-          <w:color w:val="555555"/>
-          <w:sz w:val="20"/>
-          <w:szCs w:val="20"/>
-        </w:rPr>
-        <w:t xml:space="preserve">Source : Hadith Tirmidhî : 'Faites la qaylûla, car les démons ne la font pas.' Pratique courante du Prophète ﷺ et des Compagnons.</w:t>
-      </w:r>
-    </w:p>
-    <w:p>
-      <w:pPr>
-        <w:spacing w:after="80"/>
-      </w:pPr>
-      <w:r>
-        <w:rPr>
-          <w:rFonts w:ascii="Cormorant Garamond" w:cs="Cormorant Garamond" w:eastAsia="Cormorant Garamond" w:hAnsi="Cormorant Garamond"/>
-          <w:color w:val="666666"/>
-          <w:sz w:val="20"/>
-          <w:szCs w:val="20"/>
-        </w:rPr>
-        <w:t xml:space="preserve">Note : Études : sieste courte améliore mémoire de 30%, vigilance, créativité. Évite l'épuisement de l'après-midi.</w:t>
-      </w:r>
-    </w:p>
-    <w:p>
-      <w:pPr>
-        <w:pBdr>
-          <w:bottom w:val="single" w:color="CCCCCC" w:sz="1"/>
-        </w:pBdr>
-        <w:spacing w:after="200" w:before="100"/>
-      </w:pPr>
-    </w:p>
-    <w:p>
-      <w:pPr>
-        <w:pStyle w:val="Heading2"/>
-        <w:spacing w:after="80" w:before="240"/>
-      </w:pPr>
-      <w:r>
-        <w:rPr>
-          <w:rFonts w:ascii="Cormorant Garamond" w:cs="Cormorant Garamond" w:eastAsia="Cormorant Garamond" w:hAnsi="Cormorant Garamond"/>
-          <w:b/>
-          <w:bCs/>
-          <w:sz w:val="28"/>
-          <w:szCs w:val="28"/>
-        </w:rPr>
-        <w:t xml:space="preserve">14. L'huile de cumin noir + miel (kalonji) (كلونجي مع العسل)</w:t>
+        <w:t xml:space="preserve">9. L'huile de cumin noir + miel (kalonji) (كلونجي مع العسل)</w:t>
       </w:r>
     </w:p>
     <w:p>
@@ -1195,89 +785,7 @@
           <w:sz w:val="28"/>
           <w:szCs w:val="28"/>
         </w:rPr>
-        <w:t xml:space="preserve">15. Le henné (usage médicinal) (الحناء)</w:t>
-      </w:r>
-    </w:p>
-    <w:p>
-      <w:pPr>
-        <w:spacing w:after="80"/>
-      </w:pPr>
-      <w:r>
-        <w:rPr>
-          <w:rFonts w:ascii="Cormorant Garamond" w:cs="Cormorant Garamond" w:eastAsia="Cormorant Garamond" w:hAnsi="Cormorant Garamond"/>
-          <w:i/>
-          <w:iCs/>
-          <w:sz w:val="22"/>
-          <w:szCs w:val="22"/>
-        </w:rPr>
-        <w:t xml:space="preserve">Pour : Maux de tête, brûlures, blessures cutanées, fièvre</w:t>
-      </w:r>
-    </w:p>
-    <w:p>
-      <w:pPr>
-        <w:spacing w:after="60"/>
-      </w:pPr>
-      <w:r>
-        <w:rPr>
-          <w:rFonts w:ascii="Cormorant Garamond" w:cs="Cormorant Garamond" w:eastAsia="Cormorant Garamond" w:hAnsi="Cormorant Garamond"/>
-          <w:sz w:val="22"/>
-          <w:szCs w:val="22"/>
-        </w:rPr>
-        <w:t xml:space="preserve">Pâte de henné fraîche appliquée sur le front (maux de tête) ou la zone affectée. Laisser agir 30 min, rincer.</w:t>
-      </w:r>
-    </w:p>
-    <w:p>
-      <w:pPr>
-        <w:spacing w:after="60" w:before="80"/>
-      </w:pPr>
-      <w:r>
-        <w:rPr>
-          <w:rFonts w:ascii="Cormorant Garamond" w:cs="Cormorant Garamond" w:eastAsia="Cormorant Garamond" w:hAnsi="Cormorant Garamond"/>
-          <w:i/>
-          <w:iCs/>
-          <w:color w:val="555555"/>
-          <w:sz w:val="20"/>
-          <w:szCs w:val="20"/>
-        </w:rPr>
-        <w:t xml:space="preserve">Source : Hadith Tirmidhî : 'Si quelqu'un se plaignait d'un mal de tête, le Prophète ﷺ disait : Appliquez-y du henné.' Hadith Abû Dâwûd : recommandation pour les blessures.</w:t>
-      </w:r>
-    </w:p>
-    <w:p>
-      <w:pPr>
-        <w:spacing w:after="80"/>
-      </w:pPr>
-      <w:r>
-        <w:rPr>
-          <w:rFonts w:ascii="Cormorant Garamond" w:cs="Cormorant Garamond" w:eastAsia="Cormorant Garamond" w:hAnsi="Cormorant Garamond"/>
-          <w:color w:val="666666"/>
-          <w:sz w:val="20"/>
-          <w:szCs w:val="20"/>
-        </w:rPr>
-        <w:t xml:space="preserve">Note : Henné contient lawsone, antibactérien et anti-inflammatoire. Effet rafraîchissant prouvé.</w:t>
-      </w:r>
-    </w:p>
-    <w:p>
-      <w:pPr>
-        <w:pBdr>
-          <w:bottom w:val="single" w:color="CCCCCC" w:sz="1"/>
-        </w:pBdr>
-        <w:spacing w:after="200" w:before="100"/>
-      </w:pPr>
-    </w:p>
-    <w:p>
-      <w:pPr>
-        <w:pStyle w:val="Heading2"/>
-        <w:spacing w:after="80" w:before="240"/>
-      </w:pPr>
-      <w:r>
-        <w:rPr>
-          <w:rFonts w:ascii="Cormorant Garamond" w:cs="Cormorant Garamond" w:eastAsia="Cormorant Garamond" w:hAnsi="Cormorant Garamond"/>
-          <w:b/>
-          <w:bCs/>
-          <w:sz w:val="28"/>
-          <w:szCs w:val="28"/>
-        </w:rPr>
-        <w:t xml:space="preserve">16. Le costus (qist al-hindî) (القسط الهندي)</w:t>
+        <w:t xml:space="preserve">10. Le costus (qist al-hindî) (القسط الهندي)</w:t>
       </w:r>
     </w:p>
     <w:p>
@@ -1359,7 +867,7 @@
           <w:sz w:val="28"/>
           <w:szCs w:val="28"/>
         </w:rPr>
-        <w:t xml:space="preserve">17. L'eau froide pour la fièvre (الماء البارد للحمى)</w:t>
+        <w:t xml:space="preserve">11. L'eau froide pour la fièvre (الماء البارد للحمى)</w:t>
       </w:r>
     </w:p>
     <w:p>
@@ -1441,7 +949,7 @@
           <w:sz w:val="28"/>
           <w:szCs w:val="28"/>
         </w:rPr>
-        <w:t xml:space="preserve">18. Le repos en cas de maladie (الراحة عند المرض)</w:t>
+        <w:t xml:space="preserve">12. Le repos en cas de maladie (الراحة عند المرض)</w:t>
       </w:r>
     </w:p>
     <w:p>
@@ -1523,7 +1031,7 @@
           <w:sz w:val="28"/>
           <w:szCs w:val="28"/>
         </w:rPr>
-        <w:t xml:space="preserve">19. Le lait de chamelle (حليب الإبل)</w:t>
+        <w:t xml:space="preserve">13. Le lait de chamelle (حليب الإبل)</w:t>
       </w:r>
     </w:p>
     <w:p>
@@ -1605,7 +1113,7 @@
           <w:sz w:val="28"/>
           <w:szCs w:val="28"/>
         </w:rPr>
-        <w:t xml:space="preserve">20. L'urine de chamelle (usage médicinal) (بول الإبل)</w:t>
+        <w:t xml:space="preserve">14. L'urine de chamelle (usage médicinal) (بول الإبل)</w:t>
       </w:r>
     </w:p>
     <w:p>
@@ -1687,7 +1195,7 @@
           <w:sz w:val="28"/>
           <w:szCs w:val="28"/>
         </w:rPr>
-        <w:t xml:space="preserve">21. L'eau et la dhikr pour le mauvais œil (العين)</w:t>
+        <w:t xml:space="preserve">15. L'eau et la dhikr pour le mauvais œil (العين)</w:t>
       </w:r>
     </w:p>
     <w:p>
@@ -1769,7 +1277,7 @@
           <w:sz w:val="28"/>
           <w:szCs w:val="28"/>
         </w:rPr>
-        <w:t xml:space="preserve">22. L'Âyatu-l-Kursî contre le sorcellerie (آية الكرسي)</w:t>
+        <w:t xml:space="preserve">16. L'Âyatu-l-Kursî contre le sorcellerie (آية الكرسي)</w:t>
       </w:r>
     </w:p>
     <w:p>
@@ -1851,253 +1359,7 @@
           <w:sz w:val="28"/>
           <w:szCs w:val="28"/>
         </w:rPr>
-        <w:t xml:space="preserve">23. Le jus de grenade (عصير الرمان)</w:t>
-      </w:r>
-    </w:p>
-    <w:p>
-      <w:pPr>
-        <w:spacing w:after="80"/>
-      </w:pPr>
-      <w:r>
-        <w:rPr>
-          <w:rFonts w:ascii="Cormorant Garamond" w:cs="Cormorant Garamond" w:eastAsia="Cormorant Garamond" w:hAnsi="Cormorant Garamond"/>
-          <w:i/>
-          <w:iCs/>
-          <w:sz w:val="22"/>
-          <w:szCs w:val="22"/>
-        </w:rPr>
-        <w:t xml:space="preserve">Pour : Cœur, circulation, mémoire, prévention cancers</w:t>
-      </w:r>
-    </w:p>
-    <w:p>
-      <w:pPr>
-        <w:spacing w:after="60"/>
-      </w:pPr>
-      <w:r>
-        <w:rPr>
-          <w:rFonts w:ascii="Cormorant Garamond" w:cs="Cormorant Garamond" w:eastAsia="Cormorant Garamond" w:hAnsi="Cormorant Garamond"/>
-          <w:sz w:val="22"/>
-          <w:szCs w:val="22"/>
-        </w:rPr>
-        <w:t xml:space="preserve">Un verre de jus frais par jour (sans sucre ajouté). De préférence le matin.</w:t>
-      </w:r>
-    </w:p>
-    <w:p>
-      <w:pPr>
-        <w:spacing w:after="60" w:before="80"/>
-      </w:pPr>
-      <w:r>
-        <w:rPr>
-          <w:rFonts w:ascii="Cormorant Garamond" w:cs="Cormorant Garamond" w:eastAsia="Cormorant Garamond" w:hAnsi="Cormorant Garamond"/>
-          <w:i/>
-          <w:iCs/>
-          <w:color w:val="555555"/>
-          <w:sz w:val="20"/>
-          <w:szCs w:val="20"/>
-        </w:rPr>
-        <w:t xml:space="preserve">Source : Coran 55:68 — grenadiers du Paradis. Hadith : 'Il n'y a pas une grenade qui n'a pas été fécondée par une goutte de l'eau du Paradis.'</w:t>
-      </w:r>
-    </w:p>
-    <w:p>
-      <w:pPr>
-        <w:spacing w:after="80"/>
-      </w:pPr>
-      <w:r>
-        <w:rPr>
-          <w:rFonts w:ascii="Cormorant Garamond" w:cs="Cormorant Garamond" w:eastAsia="Cormorant Garamond" w:hAnsi="Cormorant Garamond"/>
-          <w:color w:val="666666"/>
-          <w:sz w:val="20"/>
-          <w:szCs w:val="20"/>
-        </w:rPr>
-        <w:t xml:space="preserve">Note : Des études suggèrent : antioxydants puissants, baisse de la pression artérielle, protection contre Alzheimer.</w:t>
-      </w:r>
-    </w:p>
-    <w:p>
-      <w:pPr>
-        <w:pBdr>
-          <w:bottom w:val="single" w:color="CCCCCC" w:sz="1"/>
-        </w:pBdr>
-        <w:spacing w:after="200" w:before="100"/>
-      </w:pPr>
-    </w:p>
-    <w:p>
-      <w:pPr>
-        <w:pStyle w:val="Heading2"/>
-        <w:spacing w:after="80" w:before="240"/>
-      </w:pPr>
-      <w:r>
-        <w:rPr>
-          <w:rFonts w:ascii="Cormorant Garamond" w:cs="Cormorant Garamond" w:eastAsia="Cormorant Garamond" w:hAnsi="Cormorant Garamond"/>
-          <w:b/>
-          <w:bCs/>
-          <w:sz w:val="28"/>
-          <w:szCs w:val="28"/>
-        </w:rPr>
-        <w:t xml:space="preserve">24. L'eau au matin à jeun (الماء صباحا)</w:t>
-      </w:r>
-    </w:p>
-    <w:p>
-      <w:pPr>
-        <w:spacing w:after="80"/>
-      </w:pPr>
-      <w:r>
-        <w:rPr>
-          <w:rFonts w:ascii="Cormorant Garamond" w:cs="Cormorant Garamond" w:eastAsia="Cormorant Garamond" w:hAnsi="Cormorant Garamond"/>
-          <w:i/>
-          <w:iCs/>
-          <w:sz w:val="22"/>
-          <w:szCs w:val="22"/>
-        </w:rPr>
-        <w:t xml:space="preserve">Pour : Détoxification, énergie, digestion</w:t>
-      </w:r>
-    </w:p>
-    <w:p>
-      <w:pPr>
-        <w:spacing w:after="60"/>
-      </w:pPr>
-      <w:r>
-        <w:rPr>
-          <w:rFonts w:ascii="Cormorant Garamond" w:cs="Cormorant Garamond" w:eastAsia="Cormorant Garamond" w:hAnsi="Cormorant Garamond"/>
-          <w:sz w:val="22"/>
-          <w:szCs w:val="22"/>
-        </w:rPr>
-        <w:t xml:space="preserve">1-2 verres d'eau tiède (ou avec citron, miel) au réveil avant tout repas.</w:t>
-      </w:r>
-    </w:p>
-    <w:p>
-      <w:pPr>
-        <w:spacing w:after="60" w:before="80"/>
-      </w:pPr>
-      <w:r>
-        <w:rPr>
-          <w:rFonts w:ascii="Cormorant Garamond" w:cs="Cormorant Garamond" w:eastAsia="Cormorant Garamond" w:hAnsi="Cormorant Garamond"/>
-          <w:i/>
-          <w:iCs/>
-          <w:color w:val="555555"/>
-          <w:sz w:val="20"/>
-          <w:szCs w:val="20"/>
-        </w:rPr>
-        <w:t xml:space="preserve">Source : Pratique du Prophète ﷺ : boire de l'eau au réveil. Plusieurs hadiths le mentionnent.</w:t>
-      </w:r>
-    </w:p>
-    <w:p>
-      <w:pPr>
-        <w:spacing w:after="80"/>
-      </w:pPr>
-      <w:r>
-        <w:rPr>
-          <w:rFonts w:ascii="Cormorant Garamond" w:cs="Cormorant Garamond" w:eastAsia="Cormorant Garamond" w:hAnsi="Cormorant Garamond"/>
-          <w:color w:val="666666"/>
-          <w:sz w:val="20"/>
-          <w:szCs w:val="20"/>
-        </w:rPr>
-        <w:t xml:space="preserve">Note : Réhydratation après 6-8h de jeûne nocturne. Active le métabolisme. Aide la digestion.</w:t>
-      </w:r>
-    </w:p>
-    <w:p>
-      <w:pPr>
-        <w:pBdr>
-          <w:bottom w:val="single" w:color="CCCCCC" w:sz="1"/>
-        </w:pBdr>
-        <w:spacing w:after="200" w:before="100"/>
-      </w:pPr>
-    </w:p>
-    <w:p>
-      <w:pPr>
-        <w:pStyle w:val="Heading2"/>
-        <w:spacing w:after="80" w:before="240"/>
-      </w:pPr>
-      <w:r>
-        <w:rPr>
-          <w:rFonts w:ascii="Cormorant Garamond" w:cs="Cormorant Garamond" w:eastAsia="Cormorant Garamond" w:hAnsi="Cormorant Garamond"/>
-          <w:b/>
-          <w:bCs/>
-          <w:sz w:val="28"/>
-          <w:szCs w:val="28"/>
-        </w:rPr>
-        <w:t xml:space="preserve">25. Marcher après les repas (المشي بعد الأكل)</w:t>
-      </w:r>
-    </w:p>
-    <w:p>
-      <w:pPr>
-        <w:spacing w:after="80"/>
-      </w:pPr>
-      <w:r>
-        <w:rPr>
-          <w:rFonts w:ascii="Cormorant Garamond" w:cs="Cormorant Garamond" w:eastAsia="Cormorant Garamond" w:hAnsi="Cormorant Garamond"/>
-          <w:i/>
-          <w:iCs/>
-          <w:sz w:val="22"/>
-          <w:szCs w:val="22"/>
-        </w:rPr>
-        <w:t xml:space="preserve">Pour : Digestion, glycémie, métabolisme</w:t>
-      </w:r>
-    </w:p>
-    <w:p>
-      <w:pPr>
-        <w:spacing w:after="60"/>
-      </w:pPr>
-      <w:r>
-        <w:rPr>
-          <w:rFonts w:ascii="Cormorant Garamond" w:cs="Cormorant Garamond" w:eastAsia="Cormorant Garamond" w:hAnsi="Cormorant Garamond"/>
-          <w:sz w:val="22"/>
-          <w:szCs w:val="22"/>
-        </w:rPr>
-        <w:t xml:space="preserve">Marcher 10-15 minutes à allure modérée après chaque repas principal.</w:t>
-      </w:r>
-    </w:p>
-    <w:p>
-      <w:pPr>
-        <w:spacing w:after="60" w:before="80"/>
-      </w:pPr>
-      <w:r>
-        <w:rPr>
-          <w:rFonts w:ascii="Cormorant Garamond" w:cs="Cormorant Garamond" w:eastAsia="Cormorant Garamond" w:hAnsi="Cormorant Garamond"/>
-          <w:i/>
-          <w:iCs/>
-          <w:color w:val="555555"/>
-          <w:sz w:val="20"/>
-          <w:szCs w:val="20"/>
-        </w:rPr>
-        <w:t xml:space="preserve">Source : Pratique du Prophète ﷺ : ne pas s'allonger après manger. Tradition reprise par Ibn al-Qayyim.</w:t>
-      </w:r>
-    </w:p>
-    <w:p>
-      <w:pPr>
-        <w:spacing w:after="80"/>
-      </w:pPr>
-      <w:r>
-        <w:rPr>
-          <w:rFonts w:ascii="Cormorant Garamond" w:cs="Cormorant Garamond" w:eastAsia="Cormorant Garamond" w:hAnsi="Cormorant Garamond"/>
-          <w:color w:val="666666"/>
-          <w:sz w:val="20"/>
-          <w:szCs w:val="20"/>
-        </w:rPr>
-        <w:t xml:space="preserve">Note : Études : marche post-repas baisse glycémie de 30%, améliore digestion.</w:t>
-      </w:r>
-    </w:p>
-    <w:p>
-      <w:pPr>
-        <w:pBdr>
-          <w:bottom w:val="single" w:color="CCCCCC" w:sz="1"/>
-        </w:pBdr>
-        <w:spacing w:after="200" w:before="100"/>
-      </w:pPr>
-    </w:p>
-    <w:p>
-      <w:pPr>
-        <w:pStyle w:val="Heading2"/>
-        <w:spacing w:after="80" w:before="240"/>
-      </w:pPr>
-      <w:r>
-        <w:rPr>
-          <w:rFonts w:ascii="Cormorant Garamond" w:cs="Cormorant Garamond" w:eastAsia="Cormorant Garamond" w:hAnsi="Cormorant Garamond"/>
-          <w:b/>
-          <w:bCs/>
-          <w:sz w:val="28"/>
-          <w:szCs w:val="28"/>
-        </w:rPr>
-        <w:t xml:space="preserve">26. Le gingembre (الزنجبيل)</w:t>
+        <w:t xml:space="preserve">17. Le gingembre (الزنجبيل)</w:t>
       </w:r>
     </w:p>
     <w:p>
@@ -2179,89 +1441,7 @@
           <w:sz w:val="28"/>
           <w:szCs w:val="28"/>
         </w:rPr>
-        <w:t xml:space="preserve">27. La sourate Yâsîn pour le malade (سورة يس للمريض)</w:t>
-      </w:r>
-    </w:p>
-    <w:p>
-      <w:pPr>
-        <w:spacing w:after="80"/>
-      </w:pPr>
-      <w:r>
-        <w:rPr>
-          <w:rFonts w:ascii="Cormorant Garamond" w:cs="Cormorant Garamond" w:eastAsia="Cormorant Garamond" w:hAnsi="Cormorant Garamond"/>
-          <w:i/>
-          <w:iCs/>
-          <w:sz w:val="22"/>
-          <w:szCs w:val="22"/>
-        </w:rPr>
-        <w:t xml:space="preserve">Pour : Réconfort spirituel, accompagnement maladies graves, agonie</w:t>
-      </w:r>
-    </w:p>
-    <w:p>
-      <w:pPr>
-        <w:spacing w:after="60"/>
-      </w:pPr>
-      <w:r>
-        <w:rPr>
-          <w:rFonts w:ascii="Cormorant Garamond" w:cs="Cormorant Garamond" w:eastAsia="Cormorant Garamond" w:hAnsi="Cormorant Garamond"/>
-          <w:sz w:val="22"/>
-          <w:szCs w:val="22"/>
-        </w:rPr>
-        <w:t xml:space="preserve">Réciter la sourate Yâsîn sur le malade. Particulièrement aux moments difficiles.</w:t>
-      </w:r>
-    </w:p>
-    <w:p>
-      <w:pPr>
-        <w:spacing w:after="60" w:before="80"/>
-      </w:pPr>
-      <w:r>
-        <w:rPr>
-          <w:rFonts w:ascii="Cormorant Garamond" w:cs="Cormorant Garamond" w:eastAsia="Cormorant Garamond" w:hAnsi="Cormorant Garamond"/>
-          <w:i/>
-          <w:iCs/>
-          <w:color w:val="555555"/>
-          <w:sz w:val="20"/>
-          <w:szCs w:val="20"/>
-        </w:rPr>
-        <w:t xml:space="preserve">Source : Abû Dâwûd 3121 (chaîne faible). Plusieurs savants ont étendu l'usage aux malades graves.</w:t>
-      </w:r>
-    </w:p>
-    <w:p>
-      <w:pPr>
-        <w:spacing w:after="80"/>
-      </w:pPr>
-      <w:r>
-        <w:rPr>
-          <w:rFonts w:ascii="Cormorant Garamond" w:cs="Cormorant Garamond" w:eastAsia="Cormorant Garamond" w:hAnsi="Cormorant Garamond"/>
-          <w:color w:val="666666"/>
-          <w:sz w:val="20"/>
-          <w:szCs w:val="20"/>
-        </w:rPr>
-        <w:t xml:space="preserve">Note : Effet apaisant de la récitation. Soutien psychologique majeur.</w:t>
-      </w:r>
-    </w:p>
-    <w:p>
-      <w:pPr>
-        <w:pBdr>
-          <w:bottom w:val="single" w:color="CCCCCC" w:sz="1"/>
-        </w:pBdr>
-        <w:spacing w:after="200" w:before="100"/>
-      </w:pPr>
-    </w:p>
-    <w:p>
-      <w:pPr>
-        <w:pStyle w:val="Heading2"/>
-        <w:spacing w:after="80" w:before="240"/>
-      </w:pPr>
-      <w:r>
-        <w:rPr>
-          <w:rFonts w:ascii="Cormorant Garamond" w:cs="Cormorant Garamond" w:eastAsia="Cormorant Garamond" w:hAnsi="Cormorant Garamond"/>
-          <w:b/>
-          <w:bCs/>
-          <w:sz w:val="28"/>
-          <w:szCs w:val="28"/>
-        </w:rPr>
-        <w:t xml:space="preserve">28. Du'â pour la guérison (دعاء الشفاء)</w:t>
+        <w:t xml:space="preserve">18. Du'â pour la guérison (دعاء الشفاء)</w:t>
       </w:r>
     </w:p>
     <w:p>
@@ -2343,7 +1523,7 @@
           <w:sz w:val="28"/>
           <w:szCs w:val="28"/>
         </w:rPr>
-        <w:t xml:space="preserve">29. La main sur la zone douloureuse + dhikr (اليد على الألم)</w:t>
+        <w:t xml:space="preserve">19. La main sur la zone douloureuse + dhikr (اليد على الألم)</w:t>
       </w:r>
     </w:p>
     <w:p>
@@ -2425,7 +1605,7 @@
           <w:sz w:val="28"/>
           <w:szCs w:val="28"/>
         </w:rPr>
-        <w:t xml:space="preserve">30. L'évitement des excès alimentaires (تجنب الإسراف في الأكل)</w:t>
+        <w:t xml:space="preserve">20. L'évitement des excès alimentaires (تجنب الإسراف في الأكل)</w:t>
       </w:r>
     </w:p>
     <w:p>
@@ -2507,7 +1687,7 @@
           <w:sz w:val="28"/>
           <w:szCs w:val="28"/>
         </w:rPr>
-        <w:t xml:space="preserve">31. Le sourire et la patience (الابتسامة والصبر)</w:t>
+        <w:t xml:space="preserve">21. Le sourire et la patience (الابتسامة والصبر)</w:t>
       </w:r>
     </w:p>
     <w:p>
@@ -2589,89 +1769,7 @@
           <w:sz w:val="28"/>
           <w:szCs w:val="28"/>
         </w:rPr>
-        <w:t xml:space="preserve">32. L'huile de moutarde (sarson ka tel) (زيت الخردل)</w:t>
-      </w:r>
-    </w:p>
-    <w:p>
-      <w:pPr>
-        <w:spacing w:after="80"/>
-      </w:pPr>
-      <w:r>
-        <w:rPr>
-          <w:rFonts w:ascii="Cormorant Garamond" w:cs="Cormorant Garamond" w:eastAsia="Cormorant Garamond" w:hAnsi="Cormorant Garamond"/>
-          <w:i/>
-          <w:iCs/>
-          <w:sz w:val="22"/>
-          <w:szCs w:val="22"/>
-        </w:rPr>
-        <w:t xml:space="preserve">Pour : Douleurs articulaires, cheveux, peau</w:t>
-      </w:r>
-    </w:p>
-    <w:p>
-      <w:pPr>
-        <w:spacing w:after="60"/>
-      </w:pPr>
-      <w:r>
-        <w:rPr>
-          <w:rFonts w:ascii="Cormorant Garamond" w:cs="Cormorant Garamond" w:eastAsia="Cormorant Garamond" w:hAnsi="Cormorant Garamond"/>
-          <w:sz w:val="22"/>
-          <w:szCs w:val="22"/>
-        </w:rPr>
-        <w:t xml:space="preserve">Massage sur les articulations douloureuses. Sur le cuir chevelu pour renforcer les cheveux.</w:t>
-      </w:r>
-    </w:p>
-    <w:p>
-      <w:pPr>
-        <w:spacing w:after="60" w:before="80"/>
-      </w:pPr>
-      <w:r>
-        <w:rPr>
-          <w:rFonts w:ascii="Cormorant Garamond" w:cs="Cormorant Garamond" w:eastAsia="Cormorant Garamond" w:hAnsi="Cormorant Garamond"/>
-          <w:i/>
-          <w:iCs/>
-          <w:color w:val="555555"/>
-          <w:sz w:val="20"/>
-          <w:szCs w:val="20"/>
-        </w:rPr>
-        <w:t xml:space="preserve">Source : Pratique traditionnelle dans le sous-continent indien.</w:t>
-      </w:r>
-    </w:p>
-    <w:p>
-      <w:pPr>
-        <w:spacing w:after="80"/>
-      </w:pPr>
-      <w:r>
-        <w:rPr>
-          <w:rFonts w:ascii="Cormorant Garamond" w:cs="Cormorant Garamond" w:eastAsia="Cormorant Garamond" w:hAnsi="Cormorant Garamond"/>
-          <w:color w:val="666666"/>
-          <w:sz w:val="20"/>
-          <w:szCs w:val="20"/>
-        </w:rPr>
-        <w:t xml:space="preserve">Note : Riche en oméga-3, vitamine E. Anti-inflammatoire. Tradition ayurvédique reconnue.</w:t>
-      </w:r>
-    </w:p>
-    <w:p>
-      <w:pPr>
-        <w:pBdr>
-          <w:bottom w:val="single" w:color="CCCCCC" w:sz="1"/>
-        </w:pBdr>
-        <w:spacing w:after="200" w:before="100"/>
-      </w:pPr>
-    </w:p>
-    <w:p>
-      <w:pPr>
-        <w:pStyle w:val="Heading2"/>
-        <w:spacing w:after="80" w:before="240"/>
-      </w:pPr>
-      <w:r>
-        <w:rPr>
-          <w:rFonts w:ascii="Cormorant Garamond" w:cs="Cormorant Garamond" w:eastAsia="Cormorant Garamond" w:hAnsi="Cormorant Garamond"/>
-          <w:b/>
-          <w:bCs/>
-          <w:sz w:val="28"/>
-          <w:szCs w:val="28"/>
-        </w:rPr>
-        <w:t xml:space="preserve">33. Le repos sur le côté droit (النوم على الجنب الأيمن)</w:t>
+        <w:t xml:space="preserve">22. Le repos sur le côté droit (النوم على الجنب الأيمن)</w:t>
       </w:r>
     </w:p>
     <w:p>
@@ -2753,7 +1851,7 @@
           <w:sz w:val="28"/>
           <w:szCs w:val="28"/>
         </w:rPr>
-        <w:t xml:space="preserve">34. L'application de cire d'abeille (شمع العسل)</w:t>
+        <w:t xml:space="preserve">23. L'application de cire d'abeille (شمع العسل)</w:t>
       </w:r>
     </w:p>
     <w:p>
@@ -2835,7 +1933,7 @@
           <w:sz w:val="28"/>
           <w:szCs w:val="28"/>
         </w:rPr>
-        <w:t xml:space="preserve">35. L'eau de rose (ماء الورد)</w:t>
+        <w:t xml:space="preserve">24. L'eau de rose (ماء الورد)</w:t>
       </w:r>
     </w:p>
     <w:p>
@@ -2917,7 +2015,7 @@
           <w:sz w:val="28"/>
           <w:szCs w:val="28"/>
         </w:rPr>
-        <w:t xml:space="preserve">36. Le tasbîh (chapelet) contre l'anxiété (التسبيح ضد القلق)</w:t>
+        <w:t xml:space="preserve">25. Le tasbîh (chapelet) contre l'anxiété (التسبيح ضد القلق)</w:t>
       </w:r>
     </w:p>
     <w:p>
@@ -2999,7 +2097,7 @@
           <w:sz w:val="28"/>
           <w:szCs w:val="28"/>
         </w:rPr>
-        <w:t xml:space="preserve">37. Boire dans des récipients en terre (الشرب من الفخار)</w:t>
+        <w:t xml:space="preserve">26. Boire dans des récipients en terre (الشرب من الفخار)</w:t>
       </w:r>
     </w:p>
     <w:p>
@@ -3081,89 +2179,7 @@
           <w:sz w:val="28"/>
           <w:szCs w:val="28"/>
         </w:rPr>
-        <w:t xml:space="preserve">38. Le câprier (kabar) (الكبر)</w:t>
-      </w:r>
-    </w:p>
-    <w:p>
-      <w:pPr>
-        <w:spacing w:after="80"/>
-      </w:pPr>
-      <w:r>
-        <w:rPr>
-          <w:rFonts w:ascii="Cormorant Garamond" w:cs="Cormorant Garamond" w:eastAsia="Cormorant Garamond" w:hAnsi="Cormorant Garamond"/>
-          <w:i/>
-          <w:iCs/>
-          <w:sz w:val="22"/>
-          <w:szCs w:val="22"/>
-        </w:rPr>
-        <w:t xml:space="preserve">Pour : Foie, rate, hépatite</w:t>
-      </w:r>
-    </w:p>
-    <w:p>
-      <w:pPr>
-        <w:spacing w:after="60"/>
-      </w:pPr>
-      <w:r>
-        <w:rPr>
-          <w:rFonts w:ascii="Cormorant Garamond" w:cs="Cormorant Garamond" w:eastAsia="Cormorant Garamond" w:hAnsi="Cormorant Garamond"/>
-          <w:sz w:val="22"/>
-          <w:szCs w:val="22"/>
-        </w:rPr>
-        <w:t xml:space="preserve">Décoction de racines ou consommation des bourgeons (câpres) avec modération.</w:t>
-      </w:r>
-    </w:p>
-    <w:p>
-      <w:pPr>
-        <w:spacing w:after="60" w:before="80"/>
-      </w:pPr>
-      <w:r>
-        <w:rPr>
-          <w:rFonts w:ascii="Cormorant Garamond" w:cs="Cormorant Garamond" w:eastAsia="Cormorant Garamond" w:hAnsi="Cormorant Garamond"/>
-          <w:i/>
-          <w:iCs/>
-          <w:color w:val="555555"/>
-          <w:sz w:val="20"/>
-          <w:szCs w:val="20"/>
-        </w:rPr>
-        <w:t xml:space="preserve">Source : Mentionné par Ibn al-Qayyim dans Tibb an-Nabawî comme remède traditionnel pour le foie.</w:t>
-      </w:r>
-    </w:p>
-    <w:p>
-      <w:pPr>
-        <w:spacing w:after="80"/>
-      </w:pPr>
-      <w:r>
-        <w:rPr>
-          <w:rFonts w:ascii="Cormorant Garamond" w:cs="Cormorant Garamond" w:eastAsia="Cormorant Garamond" w:hAnsi="Cormorant Garamond"/>
-          <w:color w:val="666666"/>
-          <w:sz w:val="20"/>
-          <w:szCs w:val="20"/>
-        </w:rPr>
-        <w:t xml:space="preserve">Note : Études récentes : effets hépatoprotecteurs. Antioxydants reconnus.</w:t>
-      </w:r>
-    </w:p>
-    <w:p>
-      <w:pPr>
-        <w:pBdr>
-          <w:bottom w:val="single" w:color="CCCCCC" w:sz="1"/>
-        </w:pBdr>
-        <w:spacing w:after="200" w:before="100"/>
-      </w:pPr>
-    </w:p>
-    <w:p>
-      <w:pPr>
-        <w:pStyle w:val="Heading2"/>
-        <w:spacing w:after="80" w:before="240"/>
-      </w:pPr>
-      <w:r>
-        <w:rPr>
-          <w:rFonts w:ascii="Cormorant Garamond" w:cs="Cormorant Garamond" w:eastAsia="Cormorant Garamond" w:hAnsi="Cormorant Garamond"/>
-          <w:b/>
-          <w:bCs/>
-          <w:sz w:val="28"/>
-          <w:szCs w:val="28"/>
-        </w:rPr>
-        <w:t xml:space="preserve">39. Le vinaigre de pomme (خل التفاح)</w:t>
+        <w:t xml:space="preserve">27. Le vinaigre de pomme (خل التفاح)</w:t>
       </w:r>
     </w:p>
     <w:p>
@@ -3245,7 +2261,7 @@
           <w:sz w:val="28"/>
           <w:szCs w:val="28"/>
         </w:rPr>
-        <w:t xml:space="preserve">40. La sourate Al-Baqara pour la protection de la maison (سورة البقرة للمنزل)</w:t>
+        <w:t xml:space="preserve">28. La sourate Al-Baqara pour la protection de la maison (سورة البقرة للمنزل)</w:t>
       </w:r>
     </w:p>
     <w:p>
@@ -3327,7 +2343,7 @@
           <w:sz w:val="28"/>
           <w:szCs w:val="28"/>
         </w:rPr>
-        <w:t xml:space="preserve">41. Le repos visuel (regarder le vert) (النظر إلى الأخضر)</w:t>
+        <w:t xml:space="preserve">29. Le repos visuel (regarder le vert) (النظر إلى الأخضر)</w:t>
       </w:r>
     </w:p>
     <w:p>
@@ -3409,7 +2425,7 @@
           <w:sz w:val="28"/>
           <w:szCs w:val="28"/>
         </w:rPr>
-        <w:t xml:space="preserve">42. La salât comme exercice physique (الصلاة كرياضة)</w:t>
+        <w:t xml:space="preserve">30. La salât comme exercice physique (الصلاة كرياضة)</w:t>
       </w:r>
     </w:p>
     <w:p>
@@ -3491,7 +2507,7 @@
           <w:sz w:val="28"/>
           <w:szCs w:val="28"/>
         </w:rPr>
-        <w:t xml:space="preserve">43. Le jeûne du lundi-jeudi (صيام الإثنين والخميس)</w:t>
+        <w:t xml:space="preserve">31. Le jeûne du lundi-jeudi (صيام الإثنين والخميس)</w:t>
       </w:r>
     </w:p>
     <w:p>
@@ -3573,7 +2589,7 @@
           <w:sz w:val="28"/>
           <w:szCs w:val="28"/>
         </w:rPr>
-        <w:t xml:space="preserve">44. L'oignon contre les piqûres (البصل ضد اللسعات)</w:t>
+        <w:t xml:space="preserve">32. L'oignon contre les piqûres (البصل ضد اللسعات)</w:t>
       </w:r>
     </w:p>
     <w:p>
@@ -3655,7 +2671,7 @@
           <w:sz w:val="28"/>
           <w:szCs w:val="28"/>
         </w:rPr>
-        <w:t xml:space="preserve">45. L'ail à jeun (الثوم على الريق)</w:t>
+        <w:t xml:space="preserve">33. L'ail à jeun (الثوم على الريق)</w:t>
       </w:r>
     </w:p>
     <w:p>
@@ -3737,7 +2753,7 @@
           <w:sz w:val="28"/>
           <w:szCs w:val="28"/>
         </w:rPr>
-        <w:t xml:space="preserve">46. Le concombre cru (القثاء)</w:t>
+        <w:t xml:space="preserve">34. Le concombre cru (القثاء)</w:t>
       </w:r>
     </w:p>
     <w:p>
@@ -3819,89 +2835,7 @@
           <w:sz w:val="28"/>
           <w:szCs w:val="28"/>
         </w:rPr>
-        <w:t xml:space="preserve">47. Le repos après le coucher du soleil (الراحة بعد الغروب)</w:t>
-      </w:r>
-    </w:p>
-    <w:p>
-      <w:pPr>
-        <w:spacing w:after="80"/>
-      </w:pPr>
-      <w:r>
-        <w:rPr>
-          <w:rFonts w:ascii="Cormorant Garamond" w:cs="Cormorant Garamond" w:eastAsia="Cormorant Garamond" w:hAnsi="Cormorant Garamond"/>
-          <w:i/>
-          <w:iCs/>
-          <w:sz w:val="22"/>
-          <w:szCs w:val="22"/>
-        </w:rPr>
-        <w:t xml:space="preserve">Pour : Sommeil, rythme circadien</w:t>
-      </w:r>
-    </w:p>
-    <w:p>
-      <w:pPr>
-        <w:spacing w:after="60"/>
-      </w:pPr>
-      <w:r>
-        <w:rPr>
-          <w:rFonts w:ascii="Cormorant Garamond" w:cs="Cormorant Garamond" w:eastAsia="Cormorant Garamond" w:hAnsi="Cormorant Garamond"/>
-          <w:sz w:val="22"/>
-          <w:szCs w:val="22"/>
-        </w:rPr>
-        <w:t xml:space="preserve">Réduire les écrans après Maghrib. Activités calmes. Du'â avant de dormir.</w:t>
-      </w:r>
-    </w:p>
-    <w:p>
-      <w:pPr>
-        <w:spacing w:after="60" w:before="80"/>
-      </w:pPr>
-      <w:r>
-        <w:rPr>
-          <w:rFonts w:ascii="Cormorant Garamond" w:cs="Cormorant Garamond" w:eastAsia="Cormorant Garamond" w:hAnsi="Cormorant Garamond"/>
-          <w:i/>
-          <w:iCs/>
-          <w:color w:val="555555"/>
-          <w:sz w:val="20"/>
-          <w:szCs w:val="20"/>
-        </w:rPr>
-        <w:t xml:space="preserve">Source : Tradition prophétique : pas de discussions tardives sauf nécessité. Hadith : 'Le Prophète ﷺ détestait dormir avant 'Ishâ et discuter après.' (Bukhari).</w:t>
-      </w:r>
-    </w:p>
-    <w:p>
-      <w:pPr>
-        <w:spacing w:after="80"/>
-      </w:pPr>
-      <w:r>
-        <w:rPr>
-          <w:rFonts w:ascii="Cormorant Garamond" w:cs="Cormorant Garamond" w:eastAsia="Cormorant Garamond" w:hAnsi="Cormorant Garamond"/>
-          <w:color w:val="666666"/>
-          <w:sz w:val="20"/>
-          <w:szCs w:val="20"/>
-        </w:rPr>
-        <w:t xml:space="preserve">Note : Mélatonine stimulée par obscurité. Écrans bleus perturbent le sommeil. Coucher tôt = santé prouvée.</w:t>
-      </w:r>
-    </w:p>
-    <w:p>
-      <w:pPr>
-        <w:pBdr>
-          <w:bottom w:val="single" w:color="CCCCCC" w:sz="1"/>
-        </w:pBdr>
-        <w:spacing w:after="200" w:before="100"/>
-      </w:pPr>
-    </w:p>
-    <w:p>
-      <w:pPr>
-        <w:pStyle w:val="Heading2"/>
-        <w:spacing w:after="80" w:before="240"/>
-      </w:pPr>
-      <w:r>
-        <w:rPr>
-          <w:rFonts w:ascii="Cormorant Garamond" w:cs="Cormorant Garamond" w:eastAsia="Cormorant Garamond" w:hAnsi="Cormorant Garamond"/>
-          <w:b/>
-          <w:bCs/>
-          <w:sz w:val="28"/>
-          <w:szCs w:val="28"/>
-        </w:rPr>
-        <w:t xml:space="preserve">48. Boire de l'eau lentement (شرب الماء ببطء)</w:t>
+        <w:t xml:space="preserve">35. Boire de l'eau lentement (شرب الماء ببطء)</w:t>
       </w:r>
     </w:p>
     <w:p>
@@ -3983,89 +2917,7 @@
           <w:sz w:val="28"/>
           <w:szCs w:val="28"/>
         </w:rPr>
-        <w:t xml:space="preserve">49. Le rire modéré (الضحك المعتدل)</w:t>
-      </w:r>
-    </w:p>
-    <w:p>
-      <w:pPr>
-        <w:spacing w:after="80"/>
-      </w:pPr>
-      <w:r>
-        <w:rPr>
-          <w:rFonts w:ascii="Cormorant Garamond" w:cs="Cormorant Garamond" w:eastAsia="Cormorant Garamond" w:hAnsi="Cormorant Garamond"/>
-          <w:i/>
-          <w:iCs/>
-          <w:sz w:val="22"/>
-          <w:szCs w:val="22"/>
-        </w:rPr>
-        <w:t xml:space="preserve">Pour : Stress, dépression, immunité</w:t>
-      </w:r>
-    </w:p>
-    <w:p>
-      <w:pPr>
-        <w:spacing w:after="60"/>
-      </w:pPr>
-      <w:r>
-        <w:rPr>
-          <w:rFonts w:ascii="Cormorant Garamond" w:cs="Cormorant Garamond" w:eastAsia="Cormorant Garamond" w:hAnsi="Cormorant Garamond"/>
-          <w:sz w:val="22"/>
-          <w:szCs w:val="22"/>
-        </w:rPr>
-        <w:t xml:space="preserve">Sourire et rire avec mesure. Ne pas rire aux éclats répétés (le Prophète ﷺ souriait plus qu'il ne riait).</w:t>
-      </w:r>
-    </w:p>
-    <w:p>
-      <w:pPr>
-        <w:spacing w:after="60" w:before="80"/>
-      </w:pPr>
-      <w:r>
-        <w:rPr>
-          <w:rFonts w:ascii="Cormorant Garamond" w:cs="Cormorant Garamond" w:eastAsia="Cormorant Garamond" w:hAnsi="Cormorant Garamond"/>
-          <w:i/>
-          <w:iCs/>
-          <w:color w:val="555555"/>
-          <w:sz w:val="20"/>
-          <w:szCs w:val="20"/>
-        </w:rPr>
-        <w:t xml:space="preserve">Source : Hadith Tirmidhî 2305 (da'îf) : 'Le plus souvent, son rire ﷺ était un sourire.' Hadith Bukhari : 'Ne riez pas trop, car beaucoup rire fait mourir le cœur.'</w:t>
-      </w:r>
-    </w:p>
-    <w:p>
-      <w:pPr>
-        <w:spacing w:after="80"/>
-      </w:pPr>
-      <w:r>
-        <w:rPr>
-          <w:rFonts w:ascii="Cormorant Garamond" w:cs="Cormorant Garamond" w:eastAsia="Cormorant Garamond" w:hAnsi="Cormorant Garamond"/>
-          <w:color w:val="666666"/>
-          <w:sz w:val="20"/>
-          <w:szCs w:val="20"/>
-        </w:rPr>
-        <w:t xml:space="preserve">Note : Rire stimule endorphines, immunité, oxygénation. Excès = épuisement nerveux.</w:t>
-      </w:r>
-    </w:p>
-    <w:p>
-      <w:pPr>
-        <w:pBdr>
-          <w:bottom w:val="single" w:color="CCCCCC" w:sz="1"/>
-        </w:pBdr>
-        <w:spacing w:after="200" w:before="100"/>
-      </w:pPr>
-    </w:p>
-    <w:p>
-      <w:pPr>
-        <w:pStyle w:val="Heading2"/>
-        <w:spacing w:after="80" w:before="240"/>
-      </w:pPr>
-      <w:r>
-        <w:rPr>
-          <w:rFonts w:ascii="Cormorant Garamond" w:cs="Cormorant Garamond" w:eastAsia="Cormorant Garamond" w:hAnsi="Cormorant Garamond"/>
-          <w:b/>
-          <w:bCs/>
-          <w:sz w:val="28"/>
-          <w:szCs w:val="28"/>
-        </w:rPr>
-        <w:t xml:space="preserve">50. L'olive entière (fruit) (الزيتون)</w:t>
+        <w:t xml:space="preserve">36. L'olive entière (fruit) (الزيتون)</w:t>
       </w:r>
     </w:p>
     <w:p>
@@ -4147,7 +2999,7 @@
           <w:sz w:val="28"/>
           <w:szCs w:val="28"/>
         </w:rPr>
-        <w:t xml:space="preserve">51. Le lait + miel le soir (الحليب والعسل ليلا)</w:t>
+        <w:t xml:space="preserve">37. Le lait + miel le soir (الحليب والعسل ليلا)</w:t>
       </w:r>
     </w:p>
     <w:p>
@@ -4229,171 +3081,7 @@
           <w:sz w:val="28"/>
           <w:szCs w:val="28"/>
         </w:rPr>
-        <w:t xml:space="preserve">52. La marche pieds nus (earthing) (المشي حافي القدمين)</w:t>
-      </w:r>
-    </w:p>
-    <w:p>
-      <w:pPr>
-        <w:spacing w:after="80"/>
-      </w:pPr>
-      <w:r>
-        <w:rPr>
-          <w:rFonts w:ascii="Cormorant Garamond" w:cs="Cormorant Garamond" w:eastAsia="Cormorant Garamond" w:hAnsi="Cormorant Garamond"/>
-          <w:i/>
-          <w:iCs/>
-          <w:sz w:val="22"/>
-          <w:szCs w:val="22"/>
-        </w:rPr>
-        <w:t xml:space="preserve">Pour : Connexion à la terre, stress, inflammation</w:t>
-      </w:r>
-    </w:p>
-    <w:p>
-      <w:pPr>
-        <w:spacing w:after="60"/>
-      </w:pPr>
-      <w:r>
-        <w:rPr>
-          <w:rFonts w:ascii="Cormorant Garamond" w:cs="Cormorant Garamond" w:eastAsia="Cormorant Garamond" w:hAnsi="Cormorant Garamond"/>
-          <w:sz w:val="22"/>
-          <w:szCs w:val="22"/>
-        </w:rPr>
-        <w:t xml:space="preserve">Marcher pieds nus sur l'herbe, le sable, la terre 10-20 min/jour.</w:t>
-      </w:r>
-    </w:p>
-    <w:p>
-      <w:pPr>
-        <w:spacing w:after="60" w:before="80"/>
-      </w:pPr>
-      <w:r>
-        <w:rPr>
-          <w:rFonts w:ascii="Cormorant Garamond" w:cs="Cormorant Garamond" w:eastAsia="Cormorant Garamond" w:hAnsi="Cormorant Garamond"/>
-          <w:i/>
-          <w:iCs/>
-          <w:color w:val="555555"/>
-          <w:sz w:val="20"/>
-          <w:szCs w:val="20"/>
-        </w:rPr>
-        <w:t xml:space="preserve">Source : Il est rapporté dans certains récits qu'il ﷺ marchait parfois pieds nus.</w:t>
-      </w:r>
-    </w:p>
-    <w:p>
-      <w:pPr>
-        <w:spacing w:after="80"/>
-      </w:pPr>
-      <w:r>
-        <w:rPr>
-          <w:rFonts w:ascii="Cormorant Garamond" w:cs="Cormorant Garamond" w:eastAsia="Cormorant Garamond" w:hAnsi="Cormorant Garamond"/>
-          <w:color w:val="666666"/>
-          <w:sz w:val="20"/>
-          <w:szCs w:val="20"/>
-        </w:rPr>
-        <w:t xml:space="preserve">Note : Le concept moderne 'earthing' est insuffisamment prouvé scientifiquement. Les bénéfices observés relèvent surtout de la réduction du stress et de la stimulation mécanique du pied, pas nécessairement de 'l'échange d'électrons avec la Terre'.</w:t>
-      </w:r>
-    </w:p>
-    <w:p>
-      <w:pPr>
-        <w:pBdr>
-          <w:bottom w:val="single" w:color="CCCCCC" w:sz="1"/>
-        </w:pBdr>
-        <w:spacing w:after="200" w:before="100"/>
-      </w:pPr>
-    </w:p>
-    <w:p>
-      <w:pPr>
-        <w:pStyle w:val="Heading2"/>
-        <w:spacing w:after="80" w:before="240"/>
-      </w:pPr>
-      <w:r>
-        <w:rPr>
-          <w:rFonts w:ascii="Cormorant Garamond" w:cs="Cormorant Garamond" w:eastAsia="Cormorant Garamond" w:hAnsi="Cormorant Garamond"/>
-          <w:b/>
-          <w:bCs/>
-          <w:sz w:val="28"/>
-          <w:szCs w:val="28"/>
-        </w:rPr>
-        <w:t xml:space="preserve">53. Le fenouil après les repas (الشمر بعد الأكل)</w:t>
-      </w:r>
-    </w:p>
-    <w:p>
-      <w:pPr>
-        <w:spacing w:after="80"/>
-      </w:pPr>
-      <w:r>
-        <w:rPr>
-          <w:rFonts w:ascii="Cormorant Garamond" w:cs="Cormorant Garamond" w:eastAsia="Cormorant Garamond" w:hAnsi="Cormorant Garamond"/>
-          <w:i/>
-          <w:iCs/>
-          <w:sz w:val="22"/>
-          <w:szCs w:val="22"/>
-        </w:rPr>
-        <w:t xml:space="preserve">Pour : Digestion, ballonnements, mauvaise haleine</w:t>
-      </w:r>
-    </w:p>
-    <w:p>
-      <w:pPr>
-        <w:spacing w:after="60"/>
-      </w:pPr>
-      <w:r>
-        <w:rPr>
-          <w:rFonts w:ascii="Cormorant Garamond" w:cs="Cormorant Garamond" w:eastAsia="Cormorant Garamond" w:hAnsi="Cormorant Garamond"/>
-          <w:sz w:val="22"/>
-          <w:szCs w:val="22"/>
-        </w:rPr>
-        <w:t xml:space="preserve">Mâcher 1 cuillère à café de graines de fenouil après le repas.</w:t>
-      </w:r>
-    </w:p>
-    <w:p>
-      <w:pPr>
-        <w:spacing w:after="60" w:before="80"/>
-      </w:pPr>
-      <w:r>
-        <w:rPr>
-          <w:rFonts w:ascii="Cormorant Garamond" w:cs="Cormorant Garamond" w:eastAsia="Cormorant Garamond" w:hAnsi="Cormorant Garamond"/>
-          <w:i/>
-          <w:iCs/>
-          <w:color w:val="555555"/>
-          <w:sz w:val="20"/>
-          <w:szCs w:val="20"/>
-        </w:rPr>
-        <w:t xml:space="preserve">Source : Tradition arabe ancienne, validée par Ibn al-Qayyim. Cohérente avec la sunna.</w:t>
-      </w:r>
-    </w:p>
-    <w:p>
-      <w:pPr>
-        <w:spacing w:after="80"/>
-      </w:pPr>
-      <w:r>
-        <w:rPr>
-          <w:rFonts w:ascii="Cormorant Garamond" w:cs="Cormorant Garamond" w:eastAsia="Cormorant Garamond" w:hAnsi="Cormorant Garamond"/>
-          <w:color w:val="666666"/>
-          <w:sz w:val="20"/>
-          <w:szCs w:val="20"/>
-        </w:rPr>
-        <w:t xml:space="preserve">Note : Anéthol (composant actif) = digestif éprouvé. Antispasmodique.</w:t>
-      </w:r>
-    </w:p>
-    <w:p>
-      <w:pPr>
-        <w:pBdr>
-          <w:bottom w:val="single" w:color="CCCCCC" w:sz="1"/>
-        </w:pBdr>
-        <w:spacing w:after="200" w:before="100"/>
-      </w:pPr>
-    </w:p>
-    <w:p>
-      <w:pPr>
-        <w:pStyle w:val="Heading2"/>
-        <w:spacing w:after="80" w:before="240"/>
-      </w:pPr>
-      <w:r>
-        <w:rPr>
-          <w:rFonts w:ascii="Cormorant Garamond" w:cs="Cormorant Garamond" w:eastAsia="Cormorant Garamond" w:hAnsi="Cormorant Garamond"/>
-          <w:b/>
-          <w:bCs/>
-          <w:sz w:val="28"/>
-          <w:szCs w:val="28"/>
-        </w:rPr>
-        <w:t xml:space="preserve">54. Le repas chaud avant le repos (الطعام الدافئ)</w:t>
+        <w:t xml:space="preserve">38. Le repas chaud avant le repos (الطعام الدافئ)</w:t>
       </w:r>
     </w:p>
     <w:p>
@@ -4475,171 +3163,7 @@
           <w:sz w:val="28"/>
           <w:szCs w:val="28"/>
         </w:rPr>
-        <w:t xml:space="preserve">55. Le bain à l'eau salée (حمام الماء المالح)</w:t>
-      </w:r>
-    </w:p>
-    <w:p>
-      <w:pPr>
-        <w:spacing w:after="80"/>
-      </w:pPr>
-      <w:r>
-        <w:rPr>
-          <w:rFonts w:ascii="Cormorant Garamond" w:cs="Cormorant Garamond" w:eastAsia="Cormorant Garamond" w:hAnsi="Cormorant Garamond"/>
-          <w:i/>
-          <w:iCs/>
-          <w:sz w:val="22"/>
-          <w:szCs w:val="22"/>
-        </w:rPr>
-        <w:t xml:space="preserve">Pour : Détente musculaire, peau, stress</w:t>
-      </w:r>
-    </w:p>
-    <w:p>
-      <w:pPr>
-        <w:spacing w:after="60"/>
-      </w:pPr>
-      <w:r>
-        <w:rPr>
-          <w:rFonts w:ascii="Cormorant Garamond" w:cs="Cormorant Garamond" w:eastAsia="Cormorant Garamond" w:hAnsi="Cormorant Garamond"/>
-          <w:sz w:val="22"/>
-          <w:szCs w:val="22"/>
-        </w:rPr>
-        <w:t xml:space="preserve">Bain tiède + 200g de sel marin ou Epsom. 20 minutes.</w:t>
-      </w:r>
-    </w:p>
-    <w:p>
-      <w:pPr>
-        <w:spacing w:after="60" w:before="80"/>
-      </w:pPr>
-      <w:r>
-        <w:rPr>
-          <w:rFonts w:ascii="Cormorant Garamond" w:cs="Cormorant Garamond" w:eastAsia="Cormorant Garamond" w:hAnsi="Cormorant Garamond"/>
-          <w:i/>
-          <w:iCs/>
-          <w:color w:val="555555"/>
-          <w:sz w:val="20"/>
-          <w:szCs w:val="20"/>
-        </w:rPr>
-        <w:t xml:space="preserve">Source : Pratique de purification (ghusl) au cœur de l'islam. Sel comme purificateur dans plusieurs traditions.</w:t>
-      </w:r>
-    </w:p>
-    <w:p>
-      <w:pPr>
-        <w:spacing w:after="80"/>
-      </w:pPr>
-      <w:r>
-        <w:rPr>
-          <w:rFonts w:ascii="Cormorant Garamond" w:cs="Cormorant Garamond" w:eastAsia="Cormorant Garamond" w:hAnsi="Cormorant Garamond"/>
-          <w:color w:val="666666"/>
-          <w:sz w:val="20"/>
-          <w:szCs w:val="20"/>
-        </w:rPr>
-        <w:t xml:space="preserve">Note : Magnésium absorbé par la peau. Apaise tensions, articulations, peau.</w:t>
-      </w:r>
-    </w:p>
-    <w:p>
-      <w:pPr>
-        <w:pBdr>
-          <w:bottom w:val="single" w:color="CCCCCC" w:sz="1"/>
-        </w:pBdr>
-        <w:spacing w:after="200" w:before="100"/>
-      </w:pPr>
-    </w:p>
-    <w:p>
-      <w:pPr>
-        <w:pStyle w:val="Heading2"/>
-        <w:spacing w:after="80" w:before="240"/>
-      </w:pPr>
-      <w:r>
-        <w:rPr>
-          <w:rFonts w:ascii="Cormorant Garamond" w:cs="Cormorant Garamond" w:eastAsia="Cormorant Garamond" w:hAnsi="Cormorant Garamond"/>
-          <w:b/>
-          <w:bCs/>
-          <w:sz w:val="28"/>
-          <w:szCs w:val="28"/>
-        </w:rPr>
-        <w:t xml:space="preserve">56. Le lever à Fajr (الاستيقاظ للفجر)</w:t>
-      </w:r>
-    </w:p>
-    <w:p>
-      <w:pPr>
-        <w:spacing w:after="80"/>
-      </w:pPr>
-      <w:r>
-        <w:rPr>
-          <w:rFonts w:ascii="Cormorant Garamond" w:cs="Cormorant Garamond" w:eastAsia="Cormorant Garamond" w:hAnsi="Cormorant Garamond"/>
-          <w:i/>
-          <w:iCs/>
-          <w:sz w:val="22"/>
-          <w:szCs w:val="22"/>
-        </w:rPr>
-        <w:t xml:space="preserve">Pour : Rythme circadien, énergie, productivité</w:t>
-      </w:r>
-    </w:p>
-    <w:p>
-      <w:pPr>
-        <w:spacing w:after="60"/>
-      </w:pPr>
-      <w:r>
-        <w:rPr>
-          <w:rFonts w:ascii="Cormorant Garamond" w:cs="Cormorant Garamond" w:eastAsia="Cormorant Garamond" w:hAnsi="Cormorant Garamond"/>
-          <w:sz w:val="22"/>
-          <w:szCs w:val="22"/>
-        </w:rPr>
-        <w:t xml:space="preserve">Se lever à l'adhân du Fajr (avant l'aube). Prier puis bouger. Ne pas se rendormir.</w:t>
-      </w:r>
-    </w:p>
-    <w:p>
-      <w:pPr>
-        <w:spacing w:after="60" w:before="80"/>
-      </w:pPr>
-      <w:r>
-        <w:rPr>
-          <w:rFonts w:ascii="Cormorant Garamond" w:cs="Cormorant Garamond" w:eastAsia="Cormorant Garamond" w:hAnsi="Cormorant Garamond"/>
-          <w:i/>
-          <w:iCs/>
-          <w:color w:val="555555"/>
-          <w:sz w:val="20"/>
-          <w:szCs w:val="20"/>
-        </w:rPr>
-        <w:t xml:space="preserve">Source : Du'â du Prophète ﷺ : 'Ô Allâh, bénis ma communauté dans les premières heures du matin.' (Abû Dâwûd 2606, Tirmidhî 1212, Ibn Mâja 2236 — hasan).</w:t>
-      </w:r>
-    </w:p>
-    <w:p>
-      <w:pPr>
-        <w:spacing w:after="80"/>
-      </w:pPr>
-      <w:r>
-        <w:rPr>
-          <w:rFonts w:ascii="Cormorant Garamond" w:cs="Cormorant Garamond" w:eastAsia="Cormorant Garamond" w:hAnsi="Cormorant Garamond"/>
-          <w:color w:val="666666"/>
-          <w:sz w:val="20"/>
-          <w:szCs w:val="20"/>
-        </w:rPr>
-        <w:t xml:space="preserve">Note : Des études suggèrent que le lever tôt favorise la santé mentale, la productivité et l'espérance de vie. Cortisol matinal naturel.</w:t>
-      </w:r>
-    </w:p>
-    <w:p>
-      <w:pPr>
-        <w:pBdr>
-          <w:bottom w:val="single" w:color="CCCCCC" w:sz="1"/>
-        </w:pBdr>
-        <w:spacing w:after="200" w:before="100"/>
-      </w:pPr>
-    </w:p>
-    <w:p>
-      <w:pPr>
-        <w:pStyle w:val="Heading2"/>
-        <w:spacing w:after="80" w:before="240"/>
-      </w:pPr>
-      <w:r>
-        <w:rPr>
-          <w:rFonts w:ascii="Cormorant Garamond" w:cs="Cormorant Garamond" w:eastAsia="Cormorant Garamond" w:hAnsi="Cormorant Garamond"/>
-          <w:b/>
-          <w:bCs/>
-          <w:sz w:val="28"/>
-          <w:szCs w:val="28"/>
-        </w:rPr>
-        <w:t xml:space="preserve">57. Du'â de Yûnus pour la détresse (دعاء يونس)</w:t>
+        <w:t xml:space="preserve">39. Du'â de Yûnus pour la détresse (دعاء يونس)</w:t>
       </w:r>
     </w:p>
     <w:p>
@@ -4721,7 +3245,7 @@
           <w:sz w:val="28"/>
           <w:szCs w:val="28"/>
         </w:rPr>
-        <w:t xml:space="preserve">58. La satisfaction (ridâ) (الرضا)</w:t>
+        <w:t xml:space="preserve">40. La satisfaction (ridâ) (الرضا)</w:t>
       </w:r>
     </w:p>
     <w:p>
@@ -4803,89 +3327,7 @@
           <w:sz w:val="28"/>
           <w:szCs w:val="28"/>
         </w:rPr>
-        <w:t xml:space="preserve">59. L'isolement bref (khalwa) (الخلوة)</w:t>
-      </w:r>
-    </w:p>
-    <w:p>
-      <w:pPr>
-        <w:spacing w:after="80"/>
-      </w:pPr>
-      <w:r>
-        <w:rPr>
-          <w:rFonts w:ascii="Cormorant Garamond" w:cs="Cormorant Garamond" w:eastAsia="Cormorant Garamond" w:hAnsi="Cormorant Garamond"/>
-          <w:i/>
-          <w:iCs/>
-          <w:sz w:val="22"/>
-          <w:szCs w:val="22"/>
-        </w:rPr>
-        <w:t xml:space="preserve">Pour : Burn-out, sur-stimulation, surmenage</w:t>
-      </w:r>
-    </w:p>
-    <w:p>
-      <w:pPr>
-        <w:spacing w:after="60"/>
-      </w:pPr>
-      <w:r>
-        <w:rPr>
-          <w:rFonts w:ascii="Cormorant Garamond" w:cs="Cormorant Garamond" w:eastAsia="Cormorant Garamond" w:hAnsi="Cormorant Garamond"/>
-          <w:sz w:val="22"/>
-          <w:szCs w:val="22"/>
-        </w:rPr>
-        <w:t xml:space="preserve">Se retirer 30 min/jour : silence, dhikr, méditation, sans téléphone.</w:t>
-      </w:r>
-    </w:p>
-    <w:p>
-      <w:pPr>
-        <w:spacing w:after="60" w:before="80"/>
-      </w:pPr>
-      <w:r>
-        <w:rPr>
-          <w:rFonts w:ascii="Cormorant Garamond" w:cs="Cormorant Garamond" w:eastAsia="Cormorant Garamond" w:hAnsi="Cormorant Garamond"/>
-          <w:i/>
-          <w:iCs/>
-          <w:color w:val="555555"/>
-          <w:sz w:val="20"/>
-          <w:szCs w:val="20"/>
-        </w:rPr>
-        <w:t xml:space="preserve">Source : Pratique du Prophète ﷺ avant la révélation (grotte de Hirâ'). Tradition spirituelle confirmée.</w:t>
-      </w:r>
-    </w:p>
-    <w:p>
-      <w:pPr>
-        <w:spacing w:after="80"/>
-      </w:pPr>
-      <w:r>
-        <w:rPr>
-          <w:rFonts w:ascii="Cormorant Garamond" w:cs="Cormorant Garamond" w:eastAsia="Cormorant Garamond" w:hAnsi="Cormorant Garamond"/>
-          <w:color w:val="666666"/>
-          <w:sz w:val="20"/>
-          <w:szCs w:val="20"/>
-        </w:rPr>
-        <w:t xml:space="preserve">Note : Études : 10 min silence/jour = baisse cortisol, neuroplasticité, créativité accrue.</w:t>
-      </w:r>
-    </w:p>
-    <w:p>
-      <w:pPr>
-        <w:pBdr>
-          <w:bottom w:val="single" w:color="CCCCCC" w:sz="1"/>
-        </w:pBdr>
-        <w:spacing w:after="200" w:before="100"/>
-      </w:pPr>
-    </w:p>
-    <w:p>
-      <w:pPr>
-        <w:pStyle w:val="Heading2"/>
-        <w:spacing w:after="80" w:before="240"/>
-      </w:pPr>
-      <w:r>
-        <w:rPr>
-          <w:rFonts w:ascii="Cormorant Garamond" w:cs="Cormorant Garamond" w:eastAsia="Cormorant Garamond" w:hAnsi="Cormorant Garamond"/>
-          <w:b/>
-          <w:bCs/>
-          <w:sz w:val="28"/>
-          <w:szCs w:val="28"/>
-        </w:rPr>
-        <w:t xml:space="preserve">60. Le triple remède du Prophète ﷺ (الشفاء في ثلاث)</w:t>
+        <w:t xml:space="preserve">41. Le triple remède du Prophète ﷺ (الشفاء في ثلاث)</w:t>
       </w:r>
     </w:p>
     <w:p>

</xml_diff>